<commit_message>
Update report and README after enabling main protection
</commit_message>
<xml_diff>
--- a/reports/LR04_Tishin_MS.docx
+++ b/reports/LR04_Tishin_MS.docx
@@ -11421,7 +11421,7 @@
         <w:jc w:val="both"/>
       </w:pPr>
       <w:r>
-        <w:t>Для технического запрета слияния при ошибке CI необходимо активное правило защиты main с обязательной проверкой build-test-coverage. Код workflow готов; само правило защиты пока не включено и требует подтверждения владельца. Наличие workflow само по себе не запрещает ручное слияние.</w:t>
+        <w:t>26 октября 2026 года включено правило защиты main: изменения вносятся через pull request, ветка должна быть актуальна, проверка build-test-coverage от GitHub Actions обязательна. Обход ограничений администратором отключён. После сохранения публичный API ветки подтвердил активную защиту и обязательную проверку для всех участников.</w:t>
       </w:r>
     </w:p>
     <w:p>
@@ -12202,7 +12202,7 @@
         <w:jc w:val="both"/>
       </w:pPr>
       <w:r>
-        <w:t>Для завершения административной части автоматизации требуется включить защиту main. Для отдельного анализа средствами IDE предусмотрен запуск измерительного проекта и инструкция снятия CPU-профиля.</w:t>
+        <w:t>Защита main включена и применяется ко всем участникам, включая администратора. Для отдельного анализа средствами IDE предусмотрены запуск измерительного проекта и инструкция снятия CPU-профиля.</w:t>
       </w:r>
     </w:p>
     <w:p>

</xml_diff>